<commit_message>
recover execution economic reality verification
</commit_message>
<xml_diff>
--- a/docs/IT-043-001 — Economic Reality Verification MVP.docx
+++ b/docs/IT-043-001 — Economic Reality Verification MVP.docx
@@ -117,13 +117,7 @@
           <w:bCs w:val="1"/>
           <w:rtl w:val="0"/>
         </w:rPr>
-        <w:t xml:space="preserve">Capability propietaria:</w:t>
-      </w:r>
-      <w:r>
-        <w:rPr>
-          <w:rtl w:val="0"/>
-        </w:rPr>
-        <w:t xml:space="preserve"> DOC-043 — Economic Reality Verification Capability</w:t>
+        <w:t xml:space="preserve">Capability propietaria: DOC-034 — Execution &amp; Market Connectivity / CAP-007</w:t>
       </w:r>
     </w:p>
     <w:p>
@@ -141,13 +135,12 @@
           <w:bCs w:val="1"/>
           <w:rtl w:val="0"/>
         </w:rPr>
-        <w:t xml:space="preserve">Versión:</w:t>
-      </w:r>
-      <w:r>
-        <w:rPr>
-          <w:rtl w:val="0"/>
-        </w:rPr>
-        <w:t xml:space="preserve"> 1.0</w:t>
+        <w:t xml:space="preserve">Responsabilidad: Reconciliation — Economic Reality Verification</w:t>
+      </w:r>
+      <w:r>
+        <w:rPr>
+          <w:rtl w:val="0"/>
+        </w:rPr>
       </w:r>
     </w:p>
     <w:p>
@@ -165,13 +158,12 @@
           <w:bCs w:val="1"/>
           <w:rtl w:val="0"/>
         </w:rPr>
-        <w:t xml:space="preserve">Estado:</w:t>
-      </w:r>
-      <w:r>
-        <w:rPr>
-          <w:rtl w:val="0"/>
-        </w:rPr>
-        <w:t xml:space="preserve"> Approved</w:t>
+        <w:t xml:space="preserve">Versión: 1.1</w:t>
+      </w:r>
+      <w:r>
+        <w:rPr>
+          <w:rtl w:val="0"/>
+        </w:rPr>
       </w:r>
     </w:p>
     <w:p>
@@ -189,13 +181,12 @@
           <w:bCs w:val="1"/>
           <w:rtl w:val="0"/>
         </w:rPr>
-        <w:t xml:space="preserve">Tipo:</w:t>
-      </w:r>
-      <w:r>
-        <w:rPr>
-          <w:rtl w:val="0"/>
-        </w:rPr>
-        <w:t xml:space="preserve"> Incremento Técnico</w:t>
+        <w:t xml:space="preserve">Estado: Recovered — ready for implementation alignment</w:t>
+      </w:r>
+      <w:r>
+        <w:rPr>
+          <w:rtl w:val="0"/>
+        </w:rPr>
       </w:r>
     </w:p>
     <w:p>
@@ -213,13 +204,13 @@
           <w:bCs w:val="1"/>
           <w:rtl w:val="0"/>
         </w:rPr>
-        <w:t xml:space="preserve">Autoridad arquitectónica directa:</w:t>
-      </w:r>
-      <w:r>
-        <w:rPr>
-          <w:rtl w:val="0"/>
-        </w:rPr>
-        <w:t xml:space="preserve"> DOC-043</w:t>
+        <w:t xml:space="preserve">Tipo:</w:t>
+      </w:r>
+      <w:r>
+        <w:rPr>
+          <w:rtl w:val="0"/>
+        </w:rPr>
+        <w:t xml:space="preserve"> Incremento Técnico</w:t>
       </w:r>
     </w:p>
     <w:p>
@@ -237,13 +228,12 @@
           <w:bCs w:val="1"/>
           <w:rtl w:val="0"/>
         </w:rPr>
-        <w:t xml:space="preserve">Gate de preparación:</w:t>
-      </w:r>
-      <w:r>
-        <w:rPr>
-          <w:rtl w:val="0"/>
-        </w:rPr>
-        <w:t xml:space="preserve"> OA-043-002 — PASS</w:t>
+        <w:t xml:space="preserve">Autoridad arquitectónica directa: DOC-043 v1.1; DOC-034 v1.3; DOC-009</w:t>
+      </w:r>
+      <w:r>
+        <w:rPr>
+          <w:rtl w:val="0"/>
+        </w:rPr>
       </w:r>
     </w:p>
     <w:p>
@@ -261,6 +251,30 @@
           <w:bCs w:val="1"/>
           <w:rtl w:val="0"/>
         </w:rPr>
+        <w:t xml:space="preserve">Gate de preparación:</w:t>
+      </w:r>
+      <w:r>
+        <w:rPr>
+          <w:rtl w:val="0"/>
+        </w:rPr>
+        <w:t xml:space="preserve"> OA-043-002 — PASS</w:t>
+      </w:r>
+    </w:p>
+    <w:p>
+      <w:pPr>
+        <w:numPr>
+          <w:ilvl w:val="0"/>
+          <w:numId w:val="11"/>
+        </w:numPr>
+        <w:spacing w:after="0" w:afterAutospacing="0" w:before="0" w:beforeAutospacing="0" w:lineRule="auto"/>
+        <w:ind w:left="720" w:hanging="360"/>
+      </w:pPr>
+      <w:r>
+        <w:rPr>
+          <w:b w:val="1"/>
+          <w:bCs w:val="1"/>
+          <w:rtl w:val="0"/>
+        </w:rPr>
         <w:t xml:space="preserve">Dependencias públicas principales:</w:t>
       </w:r>
     </w:p>
@@ -583,7 +597,7 @@
         <w:rPr>
           <w:rtl w:val="0"/>
         </w:rPr>
-        <w:t xml:space="preserve">No reconcilia ni corrige ninguna discrepancia.</w:t>
+        <w:t xml:space="preserve">Como slice de Reconciliation, no resuelve ni corrige ninguna discrepancia y no publica por sí solo un estado reconciliado.</w:t>
       </w:r>
     </w:p>
     <w:p>
@@ -6480,19 +6494,24 @@
           <w:szCs w:val="46"/>
           <w:rtl w:val="0"/>
         </w:rPr>
-        <w:t xml:space="preserve">45. No reconciliación</w:t>
-      </w:r>
-    </w:p>
-    <w:p>
-      <w:pPr>
-        <w:spacing w:after="240" w:before="240" w:lineRule="auto"/>
-        <w:rPr/>
-      </w:pPr>
-      <w:r>
-        <w:rPr>
-          <w:rtl w:val="0"/>
-        </w:rPr>
-        <w:t xml:space="preserve">IT-043-001 no deberá:</w:t>
+        <w:t xml:space="preserve">45. No resolución ni estado reconciliado</w:t>
+      </w:r>
+    </w:p>
+    <w:p>
+      <w:pPr>
+        <w:spacing w:after="240" w:before="240" w:lineRule="auto"/>
+        <w:rPr/>
+      </w:pPr>
+      <w:r>
+        <w:rPr>
+          <w:rtl w:val="0"/>
+        </w:rPr>
+        <w:t xml:space="preserve">IT-043-001, dentro de Reconciliation, no deberá:</w:t>
+      </w:r>
+      <w:r>
+        <w:rPr>
+          <w:rtl w:val="0"/>
+        </w:rPr>
       </w:r>
     </w:p>
     <w:p>
@@ -6572,7 +6591,7 @@
         <w:rPr>
           <w:rtl w:val="0"/>
         </w:rPr>
-        <w:t xml:space="preserve">crear una operación de reconciliación.</w:t>
+        <w:t xml:space="preserve">publicar por sí solo una resolución o un estado reconciliado.</w:t>
       </w:r>
     </w:p>
     <w:p>
@@ -7416,7 +7435,7 @@
         <w:rPr>
           <w:rtl w:val="0"/>
         </w:rPr>
-        <w:t xml:space="preserve">Execution;</w:t>
+        <w:t xml:space="preserve">imports artificiales hacia un módulo físico Execution sólo para demostrar ownership;</w:t>
       </w:r>
     </w:p>
     <w:p>
@@ -11001,7 +11020,7 @@
         <w:rPr>
           <w:rtl w:val="0"/>
         </w:rPr>
-        <w:t xml:space="preserve">Capability nueva y separada;</w:t>
+        <w:t xml:space="preserve">ownership en CAP-007 / Reconciliation sin exigir acoplamiento físico artificial;</w:t>
       </w:r>
     </w:p>
     <w:p>
@@ -11169,7 +11188,7 @@
         <w:rPr>
           <w:rtl w:val="0"/>
         </w:rPr>
-        <w:t xml:space="preserve">ausencia de Reconciliation;</w:t>
+        <w:t xml:space="preserve">ausencia de resolution y de publicación de estado reconciliado;</w:t>
       </w:r>
     </w:p>
     <w:p>
@@ -11931,7 +11950,7 @@
         <w:rPr>
           <w:rtl w:val="0"/>
         </w:rPr>
-        <w:t xml:space="preserve">incorporar Reconciliation o Correction.</w:t>
+        <w:t xml:space="preserve">incorporar resolution, correction o estado reconciliado.</w:t>
       </w:r>
     </w:p>
     <w:p>
@@ -13017,7 +13036,7 @@
           <w:rFonts w:ascii="Arial Unicode MS" w:cs="Arial Unicode MS" w:eastAsia="Arial Unicode MS" w:hAnsi="Arial Unicode MS"/>
           <w:rtl w:val="0"/>
         </w:rPr>
-        <w:t xml:space="preserve">reconciliation                     ✗</w:t>
+        <w:t xml:space="preserve">resolution / reconciled state       ✗</w:t>
       </w:r>
     </w:p>
     <w:p>
@@ -13248,7 +13267,7 @@
           <w:bCs w:val="1"/>
           <w:rtl w:val="0"/>
         </w:rPr>
-        <w:t xml:space="preserve">verificar dos realidades económicas independientes, temporalmente compatibles, y publicar su relación económica granular sin reconciliarlas.</w:t>
+        <w:t xml:space="preserve">verificar, dentro de Reconciliation de CAP-007, dos realidades económicas independientes y temporalmente compatibles, publicando su relación económica granular sin resolver discrepancias ni publicar por sí sola un estado reconciliado.</w:t>
       </w:r>
     </w:p>
     <w:p>

</xml_diff>